<commit_message>
feat(jira): end sprint 1 on Aug 17, reframe development and improvements sprint and burndowns
</commit_message>
<xml_diff>
--- a/AIEM_InternshipReport_template.docx
+++ b/AIEM_InternshipReport_template.docx
@@ -2163,7 +2163,7 @@
               </w:rPr>
               <w:t>Week 2</w:t>
               <w:br/>
-              <w:t>(10 Aug - 16 Aug)</w:t>
+              <w:t>(10 Aug - 17 Aug)</w:t>
             </w:r>
           </w:p>
         </w:tc>
@@ -2266,6 +2266,8 @@
                 <w:color w:val="222222"/>
                 <w:sz w:val="18"/>
               </w:rPr>
+              <w:t>Completed Sprint 1 delivery (18 Story Points burned).</w:t>
+              <w:br/>
               <w:t>Module 10 (AI Specification) completed.</w:t>
               <w:br/>
               <w:t>Baseline triage accuracy achieved &gt;85% on 100 benchmark records.</w:t>
@@ -2303,7 +2305,7 @@
               </w:rPr>
               <w:t>Week 3</w:t>
               <w:br/>
-              <w:t>(17 Aug - 23 Aug)</w:t>
+              <w:t>(18 Aug - 24 Aug)</w:t>
             </w:r>
           </w:p>
         </w:tc>
@@ -2443,7 +2445,7 @@
               </w:rPr>
               <w:t>Week 4</w:t>
               <w:br/>
-              <w:t>(24 Aug - 30 Aug)</w:t>
+              <w:t>(25 Aug - 31 Aug)</w:t>
             </w:r>
           </w:p>
         </w:tc>
@@ -2583,7 +2585,7 @@
               </w:rPr>
               <w:t>Week 5</w:t>
               <w:br/>
-              <w:t>(31 Aug - 06 Sep)</w:t>
+              <w:t>(01 Sep - 07 Sep)</w:t>
             </w:r>
           </w:p>
         </w:tc>
@@ -2723,7 +2725,7 @@
               </w:rPr>
               <w:t>Week 6</w:t>
               <w:br/>
-              <w:t>(07 Sep - 13 Sep)</w:t>
+              <w:t>(08 Sep - 14 Sep)</w:t>
             </w:r>
           </w:p>
         </w:tc>
@@ -2863,7 +2865,7 @@
               </w:rPr>
               <w:t>Week 7</w:t>
               <w:br/>
-              <w:t>(14 Sep - 20 Sep)</w:t>
+              <w:t>(15 Sep - 21 Sep)</w:t>
             </w:r>
           </w:p>
         </w:tc>
@@ -3005,7 +3007,7 @@
               </w:rPr>
               <w:t>Week 8</w:t>
               <w:br/>
-              <w:t>(21 Sep - 27 Sep)</w:t>
+              <w:t>(22 Sep - 27 Sep)</w:t>
             </w:r>
           </w:p>
         </w:tc>
@@ -3159,7 +3161,7 @@
         <w:rPr>
           <w:color w:val="222222"/>
         </w:rPr>
-        <w:t>Sprint 1: Research and Requirements (Weeks 1–2 | 18 Story Points | Status: Closed): Achieved 100% burn from 18 pts to 0 pts on 16 August 2026. Delivered competitive benchmarking, PRD, user persona mappings, and AI model evaluation.</w:t>
+        <w:t>Sprint 1: Research and Requirements (Weeks 1–2 | 03 Aug – 17 Aug 2026 | 18 Story Points | Status: Closed): Achieved 100% burn from 18 pts to 0 pts on 17 August 2026. Delivered competitive benchmarking, PRD, user persona mappings, and AI model evaluation.</w:t>
       </w:r>
     </w:p>
     <w:p>
@@ -3178,7 +3180,7 @@
         <w:rPr>
           <w:color w:val="222222"/>
         </w:rPr>
-        <w:t>Sprint 2: Prototype Development (Weeks 3–4 | 59 Story Points | Status: Closed): Achieved 100% burn from 59 pts to 0 pts on 30 August 2026. Delivered the core architectural foundation: PostgreSQL relational schema, Express REST server, JWT security, and React SPA frame.</w:t>
+        <w:t>Sprint 2: Prototype Development (Weeks 3–4 | 18 Aug – 31 Aug 2026 | 59 Story Points | Status: Closed): Achieved 100% burn from 59 pts to 0 pts on 31 August 2026. Delivered the core architectural foundation: PostgreSQL relational schema, Express REST server, JWT security, and React SPA frame.</w:t>
       </w:r>
     </w:p>
     <w:p>
@@ -3197,7 +3199,7 @@
         <w:rPr>
           <w:color w:val="222222"/>
         </w:rPr>
-        <w:t>Sprint 3: Development and Improvements (Weeks 5–6 | 38 Story Points | Status: Closed): Achieved 100% burn from 38 pts to 0 pts on 13 September 2026. Integrated the Python FastAPI AI microservice with the React frontend, delivering live triage, mood indicators, patience scores, and response quality auditing.</w:t>
+        <w:t>Sprint 3: Development and Improvements (Weeks 5–6 | 01 Sep – 14 Sep 2026 | 38 Story Points | Status: Closed): Achieved 100% burn from 38 pts to 0 pts on 14 September 2026. Integrated the Python FastAPI AI microservice with the React frontend, delivering live triage, mood indicators, patience scores, and response quality auditing.</w:t>
       </w:r>
     </w:p>
     <w:p>
@@ -3216,7 +3218,7 @@
         <w:rPr>
           <w:color w:val="222222"/>
         </w:rPr>
-        <w:t>Sprint 4: Testing, Bug Fixes and Deployment (Weeks 7–8 | 51 Story Points | Status: Closed): Achieved 100% burn from 51 pts to 0 pts on 27 September 2026. Delivered advanced enterprise features (AI Concierge, 1-click tone polisher, HTTP 409 duplicate deflection, Supabase migration, Docker containerization, and Render cloud deployment).</w:t>
+        <w:t>Sprint 4: Testing, Bug Fixes and Deployment (Weeks 7–8 | 15 Sep – 27 Sep 2026 | 51 Story Points | Status: Closed): Achieved 100% burn from 51 pts to 0 pts on 27 September 2026. Delivered advanced enterprise features (AI Concierge, 1-click tone polisher, HTTP 409 duplicate deflection, Supabase migration, Docker containerization, and Render cloud deployment).</w:t>
       </w:r>
     </w:p>
     <w:p>

</xml_diff>

<commit_message>
feat(report): update internship duration and details in report generation script
</commit_message>
<xml_diff>
--- a/AIEM_InternshipReport_template.docx
+++ b/AIEM_InternshipReport_template.docx
@@ -433,7 +433,7 @@
                 <w:color w:val="222222"/>
                 <w:sz w:val="20"/>
               </w:rPr>
-              <w:t>8 Weeks (03 August 2026 – 27 September 2026)</w:t>
+              <w:t>03 August 2026 – 03 October 2026 (8–9 Weeks)</w:t>
             </w:r>
           </w:p>
         </w:tc>
@@ -538,7 +538,7 @@
         <w:rPr>
           <w:color w:val="222222"/>
         </w:rPr>
-        <w:t>This is to certify that Mr. Yash Sanikop, bearing Roll No. 23CO76, a bona fide student of Computer Engineering at Agnel Institute of Engineering &amp; Management (AIEM), Assagao, Goa, has successfully completed an 8-week industrial internship at Persistent Systems Ltd. from 03 August 2026 to 27 September 2026.</w:t>
+        <w:t>This is to certify that Mr. Yash Sanikop, bearing Roll No. 23CO76, a bona fide student of Computer Engineering at Agnel Institute of Engineering &amp; Management (AIEM), Assagao, Goa, has successfully completed an industrial internship at Persistent Systems Ltd. from 03 August 2026 to 03 October 2026.</w:t>
         <w:br/>
         <w:br/>
         <w:t>During this tenure, he was placed within the Cloud &amp; AI Innovations Group and actively spearheaded the design and implementation of the enterprise software project entitled “SupportSense AI: Enterprise Customer Support Ticketing Ecosystem with Real-Time Triage, Sentiment Monitoring, and Dataset-Grounded Resolution Benchmarks”. He accomplished all planned architectural deliverables, microservice integrations, and quality assurance benchmarks under the guidance of Mr. Vishal Bidikar, Senior Software Engineer at Persistent Systems Ltd.</w:t>
@@ -552,7 +552,7 @@
         <w:rPr>
           <w:color w:val="222222"/>
         </w:rPr>
-        <w:t>The internship was completed for a full-time duration of 8 weeks. Throughout the program, the student displayed exemplary technical acumen, high analytical discipline, diligent workplace conduct, and commendable participation in collaborative Agile sprints. His performance, initiative, and project outcomes were found to be satisfactory and commendable.</w:t>
+        <w:t>The internship was completed for a full-time duration of 8 to 9 weeks. Throughout the program, the student displayed exemplary technical acumen, high analytical discipline, diligent workplace conduct, and commendable participation in collaborative Agile sprints. His performance, initiative, and project outcomes were found to be satisfactory and commendable.</w:t>
       </w:r>
     </w:p>
     <w:p>
@@ -703,7 +703,7 @@
         <w:rPr>
           <w:color w:val="222222"/>
         </w:rPr>
-        <w:t>I, Yash Sanikop, hereby declare that this internship report entitled “SupportSense AI: Enterprise Customer Support Ticketing Ecosystem with Real-Time Triage, Sentiment Monitoring, and Dataset-Grounded Resolution Benchmarks” is an authentic record of the original engineering work carried out by me during my 8-week industrial internship at Persistent Systems Ltd. from 03 August 2026 to 27 September 2026.</w:t>
+        <w:t>I, Yash Sanikop, hereby declare that this internship report entitled “SupportSense AI: Enterprise Customer Support Ticketing Ecosystem with Real-Time Triage, Sentiment Monitoring, and Dataset-Grounded Resolution Benchmarks” is an authentic record of the original engineering work carried out by me during my industrial internship at Persistent Systems Ltd. from 03 August 2026 to 03 October 2026.</w:t>
       </w:r>
     </w:p>
     <w:p>
@@ -1003,7 +1003,7 @@
         <w:rPr>
           <w:color w:val="222222"/>
         </w:rPr>
-        <w:t>This report documents the engineering achievements and professional learning acquired during an 8-week industrial internship conducted at Persistent Systems Ltd. from 03 August 2026 to 27 September 2026. Modern customer support operations face acute operational bottlenecks: escalating ticket volumes, First Response Times (FRT) exceeding 8 to 12 hours, high agent burnout due to repetitive manual triage, and severe cognitive fatigue caused by reviewing lengthy multi-agent conversation threads. Traditional support software either relies on rigid, keyword-based rule engines or autonomous AI bots that hallucinate unvetted policies and cause customer frustration.</w:t>
+        <w:t>This report documents the engineering achievements and professional learning acquired during an industrial internship conducted at Persistent Systems Ltd. from 03 August 2026 to 03 October 2026. Modern customer support operations face acute operational bottlenecks: escalating ticket volumes, First Response Times (FRT) exceeding 8 to 12 hours, high agent burnout due to repetitive manual triage, and severe cognitive fatigue caused by reviewing lengthy multi-agent conversation threads. Traditional support software either relies on rigid, keyword-based rule engines or autonomous AI bots that hallucinate unvetted policies and cause customer frustration.</w:t>
       </w:r>
     </w:p>
     <w:p>
@@ -3007,7 +3007,7 @@
               </w:rPr>
               <w:t>Week 8</w:t>
               <w:br/>
-              <w:t>(22 Sep - 27 Sep)</w:t>
+              <w:t>(22 Sep - 03 Oct)</w:t>
             </w:r>
           </w:p>
         </w:tc>
@@ -3142,7 +3142,7 @@
         <w:rPr>
           <w:color w:val="222222"/>
         </w:rPr>
-        <w:t>The project maintained exceptional agile velocity across the 4 sprint iterations (strictly 2 weeks each):</w:t>
+        <w:t>The project maintained exceptional agile velocity across the 4 sprint iterations:</w:t>
       </w:r>
     </w:p>
     <w:p>
@@ -3218,7 +3218,7 @@
         <w:rPr>
           <w:color w:val="222222"/>
         </w:rPr>
-        <w:t>Sprint 4: Testing, Bug Fixes and Deployment (Weeks 7–8 | 15 Sep – 27 Sep 2026 | 51 Story Points | Status: Closed): Achieved 100% burn from 51 pts to 0 pts on 27 September 2026. Delivered advanced enterprise features (AI Concierge, 1-click tone polisher, HTTP 409 duplicate deflection, Supabase migration, Docker containerization, and Render cloud deployment).</w:t>
+        <w:t>Sprint 4: Testing, Bug Fixes and Deployment (Weeks 7–8 | 15 Sep – 03 Oct 2026 | 51 Story Points | Status: Closed): Achieved 100% burn from 51 pts to 0 pts on 03 October 2026. Delivered advanced enterprise features (AI Concierge, 1-click tone polisher, HTTP 409 duplicate deflection, Supabase migration, Docker containerization, and Render cloud deployment).</w:t>
       </w:r>
     </w:p>
     <w:p>

</xml_diff>

<commit_message>
Refactor internship report dates and update sprint details
- Adjusted week date ranges in the internship report template and Python script to reflect accurate sprint timelines.
- Updated sprint summaries to match the new date ranges and ensure consistency across documentation.
- Enhanced burndown chart generation script to align with the revised sprint dates and story points.
- Created a new script to realign Jira sprints to exact user-defined dates, ensuring accurate tracking and reporting.
- Added a test script for verifying sprint start functionality in Jira GreenHopper.
</commit_message>
<xml_diff>
--- a/AIEM_InternshipReport_template.docx
+++ b/AIEM_InternshipReport_template.docx
@@ -2163,7 +2163,7 @@
               </w:rPr>
               <w:t>Week 2</w:t>
               <w:br/>
-              <w:t>(10 Aug - 17 Aug)</w:t>
+              <w:t>(10 Aug - 15 Aug)</w:t>
             </w:r>
           </w:p>
         </w:tc>
@@ -2305,7 +2305,7 @@
               </w:rPr>
               <w:t>Week 3</w:t>
               <w:br/>
-              <w:t>(18 Aug - 24 Aug)</w:t>
+              <w:t>(16 Aug - 22 Aug)</w:t>
             </w:r>
           </w:p>
         </w:tc>
@@ -2445,7 +2445,7 @@
               </w:rPr>
               <w:t>Week 4</w:t>
               <w:br/>
-              <w:t>(25 Aug - 31 Aug)</w:t>
+              <w:t>(23 Aug - 29 Aug)</w:t>
             </w:r>
           </w:p>
         </w:tc>
@@ -2585,7 +2585,7 @@
               </w:rPr>
               <w:t>Week 5</w:t>
               <w:br/>
-              <w:t>(01 Sep - 07 Sep)</w:t>
+              <w:t>(30 Aug - 05 Sep)</w:t>
             </w:r>
           </w:p>
         </w:tc>
@@ -2725,7 +2725,7 @@
               </w:rPr>
               <w:t>Week 6</w:t>
               <w:br/>
-              <w:t>(08 Sep - 14 Sep)</w:t>
+              <w:t>(06 Sep - 12 Sep)</w:t>
             </w:r>
           </w:p>
         </w:tc>
@@ -2865,7 +2865,7 @@
               </w:rPr>
               <w:t>Week 7</w:t>
               <w:br/>
-              <w:t>(15 Sep - 21 Sep)</w:t>
+              <w:t>(13 Sep - 22 Sep)</w:t>
             </w:r>
           </w:p>
         </w:tc>
@@ -3007,7 +3007,7 @@
               </w:rPr>
               <w:t>Week 8</w:t>
               <w:br/>
-              <w:t>(22 Sep - 03 Oct)</w:t>
+              <w:t>(23 Sep - 03 Oct)</w:t>
             </w:r>
           </w:p>
         </w:tc>
@@ -3161,7 +3161,7 @@
         <w:rPr>
           <w:color w:val="222222"/>
         </w:rPr>
-        <w:t>Sprint 1: Research and Requirements (Weeks 1–2 | 03 Aug – 17 Aug 2026 | 18 Story Points | Status: Closed): Achieved 100% burn from 18 pts to 0 pts on 17 August 2026. Delivered competitive benchmarking, PRD, user persona mappings, and AI model evaluation.</w:t>
+        <w:t>Sprint 1: Research and Requirements (Weeks 1–2 | 03 Aug – 15 Aug 2026 | 18 Story Points | Status: Closed): Achieved 100% burn from 18 pts to 0 pts on 15 August 2026. Delivered competitive benchmarking, PRD, user persona mappings, and AI model evaluation.</w:t>
       </w:r>
     </w:p>
     <w:p>
@@ -3180,7 +3180,7 @@
         <w:rPr>
           <w:color w:val="222222"/>
         </w:rPr>
-        <w:t>Sprint 2: Prototype Development (Weeks 3–4 | 18 Aug – 31 Aug 2026 | 59 Story Points | Status: Closed): Achieved 100% burn from 59 pts to 0 pts on 31 August 2026. Delivered the core architectural foundation: PostgreSQL relational schema, Express REST server, JWT security, and React SPA frame.</w:t>
+        <w:t>Sprint 2: Prototype Development (Weeks 3–4 | 16 Aug – 29 Aug 2026 | 59 Story Points | Status: Closed): Achieved 100% burn from 59 pts to 0 pts on 29 August 2026. Delivered the core architectural foundation: PostgreSQL relational schema, Express REST server, JWT security, and React SPA frame.</w:t>
       </w:r>
     </w:p>
     <w:p>
@@ -3199,7 +3199,7 @@
         <w:rPr>
           <w:color w:val="222222"/>
         </w:rPr>
-        <w:t>Sprint 3: Development and Improvements (Weeks 5–6 | 01 Sep – 14 Sep 2026 | 38 Story Points | Status: Closed): Achieved 100% burn from 38 pts to 0 pts on 14 September 2026. Integrated the Python FastAPI AI microservice with the React frontend, delivering live triage, mood indicators, patience scores, and response quality auditing.</w:t>
+        <w:t>Sprint 3: Development and Improvements (Weeks 5–6 | 30 Aug – 12 Sep 2026 | 38 Story Points | Status: Closed): Achieved 100% burn from 38 pts to 0 pts on 12 September 2026. Integrated the Python FastAPI AI microservice with the React frontend, delivering live triage, mood indicators, patience scores, and response quality auditing.</w:t>
       </w:r>
     </w:p>
     <w:p>
@@ -3218,7 +3218,7 @@
         <w:rPr>
           <w:color w:val="222222"/>
         </w:rPr>
-        <w:t>Sprint 4: Testing, Bug Fixes and Deployment (Weeks 7–8 | 15 Sep – 03 Oct 2026 | 51 Story Points | Status: Closed): Achieved 100% burn from 51 pts to 0 pts on 03 October 2026. Delivered advanced enterprise features (AI Concierge, 1-click tone polisher, HTTP 409 duplicate deflection, Supabase migration, Docker containerization, and Render cloud deployment).</w:t>
+        <w:t>Sprint 4: Testing, Bug Fixes and Deployment (Weeks 7–8 | 13 Sep – 03 Oct 2026 | 51 Story Points | Status: Closed): Achieved 100% burn from 51 pts to 0 pts on 03 October 2026. Delivered advanced enterprise features (AI Concierge, 1-click tone polisher, HTTP 409 duplicate deflection, Supabase migration, Docker containerization, and Render cloud deployment).</w:t>
       </w:r>
     </w:p>
     <w:p>
@@ -3240,7 +3240,7 @@
       <w:r>
         <w:drawing>
           <wp:inline xmlns:a="http://schemas.openxmlformats.org/drawingml/2006/main" xmlns:pic="http://schemas.openxmlformats.org/drawingml/2006/picture">
-            <wp:extent cx="5669280" cy="3938880"/>
+            <wp:extent cx="5669280" cy="3997046"/>
             <wp:docPr id="2" name="Picture 2"/>
             <wp:cNvGraphicFramePr>
               <a:graphicFrameLocks noChangeAspect="1"/>
@@ -3261,7 +3261,7 @@
                   <pic:spPr>
                     <a:xfrm>
                       <a:off x="0" y="0"/>
-                      <a:ext cx="5669280" cy="3938880"/>
+                      <a:ext cx="5669280" cy="3997046"/>
                     </a:xfrm>
                     <a:prstGeom prst="rect"/>
                   </pic:spPr>
@@ -4558,7 +4558,7 @@
       <w:r>
         <w:drawing>
           <wp:inline xmlns:a="http://schemas.openxmlformats.org/drawingml/2006/main" xmlns:pic="http://schemas.openxmlformats.org/drawingml/2006/picture">
-            <wp:extent cx="5669280" cy="3938880"/>
+            <wp:extent cx="5669280" cy="3997046"/>
             <wp:docPr id="5" name="Picture 5"/>
             <wp:cNvGraphicFramePr>
               <a:graphicFrameLocks noChangeAspect="1"/>
@@ -4579,7 +4579,7 @@
                   <pic:spPr>
                     <a:xfrm>
                       <a:off x="0" y="0"/>
-                      <a:ext cx="5669280" cy="3938880"/>
+                      <a:ext cx="5669280" cy="3997046"/>
                     </a:xfrm>
                     <a:prstGeom prst="rect"/>
                   </pic:spPr>

</xml_diff>

<commit_message>
Add initial templates for Internship Report and Client Presentation
- Created a new document template for the Internship Report.
- Added a new presentation template for SupportSenseAI Client.
</commit_message>
<xml_diff>
--- a/AIEM_InternshipReport_template.docx
+++ b/AIEM_InternshipReport_template.docx
@@ -1379,15 +1379,7 @@
               <w:spacing w:after="0"/>
             </w:pPr>
             <w:r>
-              <w:t xml:space="preserve">Prof. Kedar Sawant, Asst. Professor, Computer </w:t>
-            </w:r>
-            <w:proofErr w:type="spellStart"/>
-            <w:r>
-              <w:t>Engg</w:t>
-            </w:r>
-            <w:proofErr w:type="spellEnd"/>
-            <w:r>
-              <w:t xml:space="preserve"> Dept</w:t>
+              <w:t>Prof. Kedar Sawant, Asst. Professor, Computer Engg Dept</w:t>
             </w:r>
           </w:p>
         </w:tc>
@@ -1707,7 +1699,19 @@
         <w:spacing w:line="276" w:lineRule="auto"/>
       </w:pPr>
       <w:r>
-        <w:t>The governance and engineering hierarchy of the internship project was structured to ensure clear domain ownership, seamless cross-functional integration, and tight alignment with academic standards. Industry mentorship was provided by Mr. Vishal Bidikar, Senior Software Engineer at Persistent Systems Ltd., while institutional academic leadership was guided by Prof. Laxmikant Bordekar, Principal, AIEM. The engineering team was divided into four specialized functional roles:</w:t>
+        <w:t xml:space="preserve">The governance and engineering hierarchy of the internship project was structured to ensure clear domain ownership, seamless cross-functional integration, and tight alignment with academic standards. Industry mentorship was provided by Mr. Vishal Bidikar, Senior Software Engineer at Persistent Systems Ltd., while institutional academic leadership was guided by Prof. </w:t>
+      </w:r>
+      <w:r>
+        <w:t>Kedar Sawant</w:t>
+      </w:r>
+      <w:r>
+        <w:t xml:space="preserve">, </w:t>
+      </w:r>
+      <w:r>
+        <w:t>Asst. Prof. Computer Engineering Dept.</w:t>
+      </w:r>
+      <w:r>
+        <w:t>, AIEM. The engineering team was divided into four specialized functional roles:</w:t>
       </w:r>
     </w:p>
     <w:p>
@@ -2998,6 +3002,7 @@
               <w:rPr>
                 <w:sz w:val="18"/>
               </w:rPr>
+              <w:lastRenderedPageBreak/>
               <w:t>Week 5</w:t>
             </w:r>
             <w:r>
@@ -8132,6 +8137,7 @@
               <w:rPr>
                 <w:sz w:val="18"/>
               </w:rPr>
+              <w:lastRenderedPageBreak/>
               <w:t>AI Microservice Features</w:t>
             </w:r>
           </w:p>

</xml_diff>